<commit_message>
Add third Medium story: follow-up email after a meeting
Topic picked from Ubersuggest autocomplete research across three seeds;
content gap from SERP review (thin template pages, no Medium story).
Seven situation-specific templates, 12 subject lines, an AI prompt for
writing follow-ups from notes. Lynkk-style banner and an annotated
email graphic; Word version built by make-docx.js.

Co-Authored-By: Claude Opus 5.5 <noreply@anthropic.com>
Claude-Session: https://claude.ai/code/session_013C64pm8XF1oxDj4uMpEd4H
</commit_message>
<xml_diff>
--- a/content/publish/medium-post-2.docx
+++ b/content/publish/medium-post-2.docx
@@ -1022,7 +1022,7 @@
       <w:r>
         <w:t xml:space="preserve">If you want a starting point, here's a </w:t>
       </w:r>
-      <w:hyperlink w:history="1" r:id="rIdrvfbzy0qr-kiqum6afu6f">
+      <w:hyperlink w:history="1" r:id="rId-ldmuvoudmmihq_blquny">
         <w:r>
           <w:rPr>
             <w:rStyle w:val="Hyperlink"/>
@@ -1033,7 +1033,7 @@
       <w:r>
         <w:t xml:space="preserve">. For everyday team meetings, a lighter format works better; I wrote about that in </w:t>
       </w:r>
-      <w:hyperlink w:history="1" r:id="rIdzl3bmn6ecm0pwkpehyxfd">
+      <w:hyperlink w:history="1" r:id="rId7v7nc5baukxo4y_pryf2_">
         <w:r>
           <w:rPr>
             <w:rStyle w:val="Hyperlink"/>
@@ -1168,7 +1168,7 @@
       <w:r>
         <w:t xml:space="preserve">AI meeting assistants can now record a meeting and draft both documents from the same conversation. Tools like </w:t>
       </w:r>
-      <w:hyperlink w:history="1" r:id="rIdyj6glh1cvxn0ylwbkdwz3">
+      <w:hyperlink w:history="1" r:id="rIdjvnf5xbdzabnomwc3le24">
         <w:r>
           <w:rPr>
             <w:rStyle w:val="Hyperlink"/>

</xml_diff>